<commit_message>
corpus: plain-English feature names on screen (Music Maker · Groups · Memories · Loved ones)
Rename banners on the Pakanta iteration spec (+ docx regen), the Alaala pillar
and the Samahan build plan; 0036 row in CLAUDE.md names Music Maker. Identifiers
stay. Repo PR: rd/pakanta-is-music-maker.

Co-Authored-By: Claude Opus 5.5 <noreply@anthropic.com>
</commit_message>
<xml_diff>
--- a/0036_pakanta/0036_pakanta.docx
+++ b/0036_pakanta/0036_pakanta.docx
@@ -9,6 +9,136 @@
       </w:pPr>
       <w:r>
         <w:t xml:space="preserve">Iteration 0036 — Pakanta · Your Wedding’s Own Song</w:t>
+      </w:r>
+    </w:p>
+    <w:p>
+      <w:pPr>
+        <w:pStyle w:val="BlockText"/>
+      </w:pPr>
+      <w:r>
+        <w:t xml:space="preserve">🏷</w:t>
+      </w:r>
+      <w:r>
+        <w:t xml:space="preserve"> </w:t>
+      </w:r>
+      <w:r>
+        <w:rPr>
+          <w:b/>
+          <w:bCs/>
+        </w:rPr>
+        <w:t xml:space="preserve">RENAMED 2026-09-29 — on screen this is now</w:t>
+      </w:r>
+      <w:r>
+        <w:rPr>
+          <w:b/>
+          <w:bCs/>
+        </w:rPr>
+        <w:t xml:space="preserve"> </w:t>
+      </w:r>
+      <w:r>
+        <w:rPr>
+          <w:b/>
+          <w:bCs/>
+        </w:rPr>
+        <w:t xml:space="preserve">“Music Maker”</w:t>
+      </w:r>
+      <w:r>
+        <w:rPr>
+          <w:b/>
+          <w:bCs/>
+        </w:rPr>
+        <w:t xml:space="preserve">.</w:t>
+      </w:r>
+      <w:r>
+        <w:t xml:space="preserve"> </w:t>
+      </w:r>
+      <w:r>
+        <w:t xml:space="preserve">Owner:</w:t>
+      </w:r>
+      <w:r>
+        <w:t xml:space="preserve"> </w:t>
+      </w:r>
+      <w:r>
+        <w:rPr>
+          <w:i/>
+          <w:iCs/>
+        </w:rPr>
+        <w:t xml:space="preserve">“Only Papic is customized and all other namings should be generic”</w:t>
+      </w:r>
+      <w:r>
+        <w:t xml:space="preserve"> </w:t>
+      </w:r>
+      <w:r>
+        <w:t xml:space="preserve">(DECISION_LOG rows</w:t>
+      </w:r>
+      <w:r>
+        <w:t xml:space="preserve"> </w:t>
+      </w:r>
+      <w:r>
+        <w:t xml:space="preserve">“PAKANTA IS RENAMED</w:t>
+      </w:r>
+      <w:r>
+        <w:t xml:space="preserve"> </w:t>
+      </w:r>
+      <w:r>
+        <w:t xml:space="preserve">‘MUSIC MAKER’</w:t>
+      </w:r>
+      <w:r>
+        <w:t xml:space="preserve">”</w:t>
+      </w:r>
+      <w:r>
+        <w:t xml:space="preserve">,</w:t>
+      </w:r>
+      <w:r>
+        <w:t xml:space="preserve"> </w:t>
+      </w:r>
+      <w:r>
+        <w:t xml:space="preserve">“ONLY PAPIC KEEPS A CUSTOM NAME”</w:t>
+      </w:r>
+      <w:r>
+        <w:t xml:space="preserve">,</w:t>
+      </w:r>
+      <w:r>
+        <w:t xml:space="preserve"> </w:t>
+      </w:r>
+      <w:r>
+        <w:t xml:space="preserve">“PATIKTOK KEEPS ITS NAME (WITH PAPIC); ALAGA → LOVED ONES”</w:t>
+      </w:r>
+      <w:r>
+        <w:t xml:space="preserve">).</w:t>
+      </w:r>
+      <w:r>
+        <w:t xml:space="preserve"> </w:t>
+      </w:r>
+      <w:r>
+        <w:t xml:space="preserve">“Pakanta”</w:t>
+      </w:r>
+      <w:r>
+        <w:t xml:space="preserve"> </w:t>
+      </w:r>
+      <w:r>
+        <w:t xml:space="preserve">below is the historical/internal name: routes, tables, SKU codes and file names keep it; every word a person reads says</w:t>
+      </w:r>
+      <w:r>
+        <w:t xml:space="preserve"> </w:t>
+      </w:r>
+      <w:r>
+        <w:t xml:space="preserve">“Music Maker”</w:t>
+      </w:r>
+      <w:r>
+        <w:t xml:space="preserve">. Guarded in code by</w:t>
+      </w:r>
+      <w:r>
+        <w:t xml:space="preserve"> </w:t>
+      </w:r>
+      <w:r>
+        <w:rPr>
+          <w:rStyle w:val="VerbatimChar"/>
+        </w:rPr>
+        <w:t xml:space="preserve">apps/web/lib/retired-names-stay-off-screen.test.ts</w:t>
+      </w:r>
+      <w:r>
+        <w:t xml:space="preserve">.</w:t>
       </w:r>
     </w:p>
     <w:p>

</xml_diff>